<commit_message>
Add SQL Server high availability experience
</commit_message>
<xml_diff>
--- a/Output/Pedro_Gutierrez_DWConsulware_DBA_SQL_Server_Senior_CV.docx
+++ b/Output/Pedro_Gutierrez_DWConsulware_DBA_SQL_Server_Senior_CV.docx
@@ -123,6 +123,29 @@
           <w:sz w:val="18"/>
         </w:rPr>
         <w:t>operación de ambientes productivos, acceso y seguridad, backup/restore, mantenimiento, SQL Agent, monitoreo, resolución de incidentes y soporte de disponibilidad</w:t>
+      </w:r>
+    </w:p>
+    <w:p>
+      <w:pPr>
+        <w:spacing w:after="34"/>
+      </w:pPr>
+      <w:r>
+        <w:rPr>
+          <w:rFonts w:ascii="Aptos" w:hAnsi="Aptos"/>
+          <w:b/>
+          <w:i w:val="0"/>
+          <w:sz w:val="18"/>
+        </w:rPr>
+        <w:t xml:space="preserve">Alta disponibilidad: </w:t>
+      </w:r>
+      <w:r>
+        <w:rPr>
+          <w:rFonts w:ascii="Aptos" w:hAnsi="Aptos"/>
+          <w:b w:val="0"/>
+          <w:i w:val="0"/>
+          <w:sz w:val="18"/>
+        </w:rPr>
+        <w:t>SQL Server Always On Availability Groups, Failover Cluster Instances (FCI), Windows Server Failover Clustering (WSFC), monitoreo, validación de sincronización, failover y troubleshooting</w:t>
       </w:r>
     </w:p>
     <w:p>
@@ -300,6 +323,23 @@
           <w:i w:val="0"/>
           <w:sz w:val="18"/>
         </w:rPr>
+        <w:t>Doy soporte a configuraciones SQL Server Always On Availability Groups y Windows Server Failover Clustering, incluyendo monitoreo, validación de sincronización, failover y troubleshooting de disponibilidad.</w:t>
+      </w:r>
+    </w:p>
+    <w:p>
+      <w:pPr>
+        <w:pStyle w:val="ListBullet"/>
+        <w:keepLines/>
+        <w:spacing w:after="28" w:line="245" w:lineRule="auto"/>
+        <w:ind w:left="288" w:hanging="173"/>
+      </w:pPr>
+      <w:r>
+        <w:rPr>
+          <w:rFonts w:ascii="Aptos" w:hAnsi="Aptos"/>
+          <w:b w:val="0"/>
+          <w:i w:val="0"/>
+          <w:sz w:val="18"/>
+        </w:rPr>
         <w:t>Diseñé un modelo de acceso basado en roles, mínimo privilegio y acceso privilegiado JIT; audité logins, usuarios, permisos y procedimientos posteriores a restauraciones.</w:t>
       </w:r>
     </w:p>
@@ -376,7 +416,7 @@
           <w:color w:val="5B5B5B"/>
           <w:sz w:val="17"/>
         </w:rPr>
-        <w:t>SQL Server, AWS RDS, T-SQL, SSMS, DBeaver, SQL Agent, Database Mail, PowerShell, JSON/OpenJSON, Git, RBAC, JIT, backup/restore, monitoreo</w:t>
+        <w:t>SQL Server, AWS RDS, Always On Availability Groups, WSFC, T-SQL, SSMS, DBeaver, SQL Agent, Database Mail, PowerShell, JSON/OpenJSON, Git, RBAC, JIT, backup/restore, monitoreo</w:t>
       </w:r>
     </w:p>
     <w:p>
@@ -753,6 +793,23 @@
           <w:i w:val="0"/>
           <w:sz w:val="18"/>
         </w:rPr>
+        <w:t>Implementé y soporté alta disponibilidad con SQL Server Failover Cluster Instances y Windows Server Failover Clustering, atendiendo validaciones, failover y resolución de incidentes.</w:t>
+      </w:r>
+    </w:p>
+    <w:p>
+      <w:pPr>
+        <w:pStyle w:val="ListBullet"/>
+        <w:keepLines/>
+        <w:spacing w:after="28" w:line="245" w:lineRule="auto"/>
+        <w:ind w:left="288" w:hanging="173"/>
+      </w:pPr>
+      <w:r>
+        <w:rPr>
+          <w:rFonts w:ascii="Aptos" w:hAnsi="Aptos"/>
+          <w:b w:val="0"/>
+          <w:i w:val="0"/>
+          <w:sz w:val="18"/>
+        </w:rPr>
         <w:t>Entregué soluciones de bases de datos, integración y BI alineadas con requisitos de rendimiento e infraestructura.</w:t>
       </w:r>
     </w:p>
@@ -778,7 +835,7 @@
           <w:color w:val="5B5B5B"/>
           <w:sz w:val="17"/>
         </w:rPr>
-        <w:t>SQL Server, SSIS, SSRS, PostgreSQL, Power BI, Excel</w:t>
+        <w:t>SQL Server, Failover Cluster Instances, WSFC, SSIS, SSRS, PostgreSQL, Power BI, Excel</w:t>
       </w:r>
     </w:p>
     <w:p>

</xml_diff>